<commit_message>
feat: implement hierarchical explainable multi-agent system with decision engine and comprehensive documentation
</commit_message>
<xml_diff>
--- a/documentation/format/Project thesis format.docx
+++ b/documentation/format/Project thesis format.docx
@@ -1391,7 +1391,7 @@
       </w:tblPr>
       <w:tblGrid>
         <w:gridCol w:w="2162"/>
-        <w:gridCol w:w="2102"/>
+        <w:gridCol w:w="3635"/>
       </w:tblGrid>
       <w:tr>
         <w:trPr>
@@ -1876,6 +1876,63 @@
           </w:p>
         </w:tc>
       </w:tr>
+      <w:tr>
+        <w:trPr>
+          <w:tblCellSpacing w:w="15" w:type="dxa"/>
+        </w:trPr>
+        <w:tc>
+          <w:tcPr>
+            <w:tcW w:w="0" w:type="auto"/>
+            <w:vAlign w:val="center"/>
+          </w:tcPr>
+          <w:p>
+            <w:pPr>
+              <w:spacing w:after="0" w:line="240" w:lineRule="auto"/>
+              <w:rPr>
+                <w:rFonts w:ascii="Times New Roman" w:eastAsia="Times New Roman" w:hAnsi="Times New Roman" w:cs="Times New Roman"/>
+                <w:sz w:val="24"/>
+                <w:szCs w:val="24"/>
+                <w:lang w:val="en-US"/>
+              </w:rPr>
+            </w:pPr>
+            <w:r>
+              <w:rPr>
+                <w:rFonts w:ascii="Times New Roman" w:eastAsia="Times New Roman" w:hAnsi="Times New Roman" w:cs="Times New Roman"/>
+                <w:sz w:val="24"/>
+                <w:szCs w:val="24"/>
+                <w:lang w:val="en-US"/>
+              </w:rPr>
+              <w:t>Total pages</w:t>
+            </w:r>
+          </w:p>
+        </w:tc>
+        <w:tc>
+          <w:tcPr>
+            <w:tcW w:w="0" w:type="auto"/>
+            <w:vAlign w:val="center"/>
+          </w:tcPr>
+          <w:p>
+            <w:pPr>
+              <w:spacing w:after="0" w:line="240" w:lineRule="auto"/>
+              <w:rPr>
+                <w:rFonts w:ascii="Times New Roman" w:eastAsia="Times New Roman" w:hAnsi="Times New Roman" w:cs="Times New Roman"/>
+                <w:sz w:val="24"/>
+                <w:szCs w:val="24"/>
+                <w:lang w:val="en-US"/>
+              </w:rPr>
+            </w:pPr>
+            <w:r>
+              <w:rPr>
+                <w:rFonts w:ascii="Times New Roman" w:eastAsia="Times New Roman" w:hAnsi="Times New Roman" w:cs="Times New Roman"/>
+                <w:sz w:val="24"/>
+                <w:szCs w:val="24"/>
+                <w:lang w:val="en-US"/>
+              </w:rPr>
+              <w:t>70 – 80 (ignoring preliminary pages)</w:t>
+            </w:r>
+          </w:p>
+        </w:tc>
+      </w:tr>
     </w:tbl>
     <w:p>
       <w:r>
@@ -1906,23 +1963,7 @@
       </w:r>
       <w:r>
         <w:br/>
-        <w:t xml:space="preserve">sub </w:t>
-      </w:r>
-      <w:proofErr w:type="spellStart"/>
-      <w:r>
-        <w:t>sub</w:t>
-      </w:r>
-      <w:proofErr w:type="spellEnd"/>
-      <w:r>
-        <w:t xml:space="preserve"> </w:t>
-      </w:r>
-      <w:proofErr w:type="spellStart"/>
-      <w:r>
-        <w:t>heding</w:t>
-      </w:r>
-      <w:proofErr w:type="spellEnd"/>
-      <w:r>
-        <w:t xml:space="preserve"> 12</w:t>
+        <w:t>sub sub heding 12</w:t>
       </w:r>
       <w:r>
         <w:br/>

</xml_diff>

<commit_message>
Add note "Line space 1.5" in format spec doc
</commit_message>
<xml_diff>
--- a/documentation/format/Project thesis format.docx
+++ b/documentation/format/Project thesis format.docx
@@ -1963,11 +1963,31 @@
       </w:r>
       <w:r>
         <w:br/>
-        <w:t>sub sub heding 12</w:t>
+        <w:t xml:space="preserve">sub </w:t>
+      </w:r>
+      <w:proofErr w:type="spellStart"/>
+      <w:r>
+        <w:t>sub</w:t>
+      </w:r>
+      <w:proofErr w:type="spellEnd"/>
+      <w:r>
+        <w:t xml:space="preserve"> </w:t>
+      </w:r>
+      <w:proofErr w:type="spellStart"/>
+      <w:r>
+        <w:t>heding</w:t>
+      </w:r>
+      <w:proofErr w:type="spellEnd"/>
+      <w:r>
+        <w:t xml:space="preserve"> 12</w:t>
       </w:r>
       <w:r>
         <w:br/>
         <w:t>content 12</w:t>
+      </w:r>
+      <w:r>
+        <w:br/>
+        <w:t>Line Space: 1.5</w:t>
       </w:r>
     </w:p>
     <w:sectPr>

</xml_diff>